<commit_message>
Personalize PFE report and embed 7 project diagrams
- Fill cover, signature block and remerciements: Oussema Korbosli (étudiant),
  Heni Abidi (encadrant académique), Melek Elmoula (maître de stage), BTK –
  Banque Tuniso-Koweïtienne (organisme d'accueil); update Résumé/Abstract and
  section 1.2 accordingly.
- Generate and embed 7 diagrams rendered from the project with PlantUML:
  use-case, layered architecture, class, sequence (validation d'une demande),
  ER schema, BI star model (V_BI_*), and Gantt.
- Keep placeholders for the official BTK logo and 5 app screenshots.
- Add rapport/diagrams/ (PlantUML sources, PNGs, generator) and refresh the
  figure list and finalization guide.

Co-Authored-By: Claude Opus 4.8 <noreply@anthropic.com>
Claude-Session: https://claude.ai/code/session_01XrCEv79rD628gYBfC2XWx6
</commit_message>
<xml_diff>
--- a/rapport/Rapport_de_stage_PFE_gestion-agences.docx
+++ b/rapport/Rapport_de_stage_PFE_gestion-agences.docx
@@ -664,7 +664,7 @@
           <w:sz w:val="28"/>
           <w:szCs w:val="28"/>
         </w:rPr>
-        <w:t>Nom &amp; Prénom</w:t>
+        <w:t>Melek Elmoula</w:t>
       </w:r>
     </w:p>
     <w:p>
@@ -687,7 +687,7 @@
           <w:sz w:val="28"/>
           <w:szCs w:val="28"/>
         </w:rPr>
-        <w:t>Nom &amp; Prénom</w:t>
+        <w:t>Heni Abidi</w:t>
       </w:r>
     </w:p>
     <w:p>
@@ -954,6 +954,9 @@
                 <w:szCs w:val="28"/>
               </w:rPr>
             </w:pPr>
+            <w:r>
+              <w:t>Melek Elmoula</w:t>
+            </w:r>
           </w:p>
         </w:tc>
         <w:tc>
@@ -1007,6 +1010,9 @@
                 <w:szCs w:val="20"/>
               </w:rPr>
             </w:pPr>
+            <w:r>
+              <w:t>Heni Abidi</w:t>
+            </w:r>
           </w:p>
         </w:tc>
         <w:tc>
@@ -1483,7 +1489,7 @@
           <w:sz w:val="20"/>
           <w:szCs w:val="20"/>
         </w:rPr>
-        <w:t>Réalisé au sein de [organisme d’accueil], ce projet de fin d’études porte sur la conception et la réalisation d’une application web de gestion des agences bancaires, enrichie d’un volet décisionnel (Business Intelligence). L’objectif est de centraliser la gestion du réseau d’agences — agences, employés, clients et objectifs commerciaux — au sein d’une plateforme unique, tout en automatisant les circuits de validation des demandes (création de clients, d’employés et modification de données). L’application a été développée avec la plateforme Jakarta EE 10 (Servlets, JSP, EJB, JPA/Hibernate) au-dessus d’une base de données Oracle, selon une architecture en couches. Le volet décisionnel s’appuie sur des vues SQL analytiques exposées à Microsoft Power BI ainsi que sur un tableau de bord embarqué (ApexCharts) offrant aux responsables des indicateurs de performance (effectifs par agence, répartition des clients, suivi des objectifs). La solution améliore la productivité, la traçabilité des opérations et la prise de décision.</w:t>
+        <w:t>Réalisé au sein de la BTK – Banque Tuniso-Koweïtienne, ce projet de fin d’études porte sur la conception et la réalisation d’une application web de gestion des agences bancaires, enrichie d’un volet décisionnel (Business Intelligence). L’objectif est de centraliser la gestion du réseau d’agences — agences, employés, clients et objectifs commerciaux — au sein d’une plateforme unique, tout en automatisant les circuits de validation des demandes (création de clients, d’employés et modification de données). L’application a été développée avec la plateforme Jakarta EE 10 (Servlets, JSP, EJB, JPA/Hibernate) au-dessus d’une base de données Oracle, selon une architecture en couches. Le volet décisionnel s’appuie sur des vues SQL analytiques exposées à Microsoft Power BI ainsi que sur un tableau de bord embarqué (ApexCharts) offrant aux responsables des indicateurs de performance (effectifs par agence, répartition des clients, suivi des objectifs). La solution améliore la productivité, la traçabilité des opérations et la prise de décision.</w:t>
       </w:r>
     </w:p>
     <w:p>
@@ -1551,7 +1557,7 @@
           <w:sz w:val="20"/>
           <w:szCs w:val="20"/>
         </w:rPr>
-        <w:t>Carried out within [host organization], this end-of-studies project deals with the design and implementation of a web application for managing bank branches, enhanced with a Business Intelligence component. The goal is to centralize the management of the branch network — branches, employees, customers and commercial objectives — within a single platform, while automating the approval workflows for requests (customer and employee creation, data modification). The application was developed with the Jakarta EE 10 platform (Servlets, JSP, EJB, JPA/Hibernate) on top of an Oracle database, following a layered architecture. The decision-support component relies on analytical SQL views exposed to Microsoft Power BI as well as an embedded dashboard (ApexCharts) providing managers with key performance indicators (headcount per branch, customer distribution, objective tracking). The solution improves productivity, operation traceability and decision-making.</w:t>
+        <w:t>Carried out within BTK – Banque Tuniso-Koweïtienne (a Tunisian bank), this end-of-studies project deals with the design and implementation of a web application for managing bank branches, enhanced with a Business Intelligence component. The goal is to centralize the management of the branch network — branches, employees, customers and commercial objectives — within a single platform, while automating the approval workflows for requests (customer and employee creation, data modification). The application was developed with the Jakarta EE 10 platform (Servlets, JSP, EJB, JPA/Hibernate) on top of an Oracle database, following a layered architecture. The decision-support component relies on analytical SQL views exposed to Microsoft Power BI as well as an embedded dashboard (ApexCharts) providing managers with key performance indicators (headcount per branch, customer distribution, objective tracking). The solution improves productivity, operation traceability and decision-making.</w:t>
       </w:r>
     </w:p>
     <w:p>
@@ -1848,7 +1854,7 @@
         <w:jc w:val="both"/>
       </w:pPr>
       <w:r>
-        <w:t>Je remercie chaleureusement mon encadrant académique, [Nom &amp; Prénom], pour ses conseils avisés, sa disponibilité et son suivi rigoureux tout au long de ce projet. Mes remerciements s’adressent également à mon maître de stage, [Nom &amp; Prénom], au sein de [organisme d’accueil], pour la confiance qu’il m’a accordée, son accompagnement et le partage de son expérience métier.</w:t>
+        <w:t>Je remercie chaleureusement mon encadrant académique, Heni Abidi, pour ses conseils avisés, sa disponibilité et son suivi rigoureux tout au long de ce projet. Mes remerciements s’adressent également à mon maître de stage, Melek Elmoula, au sein de la BTK – Banque Tuniso-Koweïtienne, pour la confiance accordée, l’accompagnement et le partage de l’expérience métier.</w:t>
       </w:r>
     </w:p>
     <w:p>
@@ -1933,7 +1939,7 @@
         <w:jc w:val="both"/>
       </w:pPr>
       <w:r>
-        <w:t>•  Figure 1 : Architecture en couches de l’application</w:t>
+        <w:t>•  Figure 1 : Logo de la BTK</w:t>
       </w:r>
     </w:p>
     <w:p>
@@ -1951,7 +1957,7 @@
         <w:jc w:val="both"/>
       </w:pPr>
       <w:r>
-        <w:t>•  Figure 3 : Diagramme de classes (modèle métier)</w:t>
+        <w:t>•  Figure 3 : Architecture en couches de l’application</w:t>
       </w:r>
     </w:p>
     <w:p>
@@ -1960,7 +1966,7 @@
         <w:jc w:val="both"/>
       </w:pPr>
       <w:r>
-        <w:t>•  Figure 4 : Schéma relationnel de la base de données</w:t>
+        <w:t>•  Figure 4 : Diagramme de classes (modèle métier)</w:t>
       </w:r>
     </w:p>
     <w:p>
@@ -1969,7 +1975,7 @@
         <w:jc w:val="both"/>
       </w:pPr>
       <w:r>
-        <w:t>•  Figure 5 : Modèle décisionnel (vues V_BI_*)</w:t>
+        <w:t>•  Figure 5 : Diagramme de séquence « Validation d’une demande »</w:t>
       </w:r>
     </w:p>
     <w:p>
@@ -1978,7 +1984,7 @@
         <w:jc w:val="both"/>
       </w:pPr>
       <w:r>
-        <w:t>•  Figure 6 : Tableau de bord de l’application (ApexCharts)</w:t>
+        <w:t>•  Figure 6 : Schéma relationnel de la base de données</w:t>
       </w:r>
     </w:p>
     <w:p>
@@ -1987,7 +1993,61 @@
         <w:jc w:val="both"/>
       </w:pPr>
       <w:r>
-        <w:t>•  Figure 7 : Rapport Power BI – analyse des effectifs et objectifs</w:t>
+        <w:t>•  Figure 7 : Modèle décisionnel (vues V_BI_*)</w:t>
+      </w:r>
+    </w:p>
+    <w:p>
+      <w:pPr>
+        <w:pStyle w:val="Paragraphedeliste"/>
+        <w:jc w:val="both"/>
+      </w:pPr>
+      <w:r>
+        <w:t>•  Figure 8 : Page d’authentification</w:t>
+      </w:r>
+    </w:p>
+    <w:p>
+      <w:pPr>
+        <w:pStyle w:val="Paragraphedeliste"/>
+        <w:jc w:val="both"/>
+      </w:pPr>
+      <w:r>
+        <w:t>•  Figure 9 : Tableau de bord de l’application (ApexCharts)</w:t>
+      </w:r>
+    </w:p>
+    <w:p>
+      <w:pPr>
+        <w:pStyle w:val="Paragraphedeliste"/>
+        <w:jc w:val="both"/>
+      </w:pPr>
+      <w:r>
+        <w:t>•  Figure 10 : Module de gestion des agences / employés / clients</w:t>
+      </w:r>
+    </w:p>
+    <w:p>
+      <w:pPr>
+        <w:pStyle w:val="Paragraphedeliste"/>
+        <w:jc w:val="both"/>
+      </w:pPr>
+      <w:r>
+        <w:t>•  Figure 11 : Gestion des demandes et validation</w:t>
+      </w:r>
+    </w:p>
+    <w:p>
+      <w:pPr>
+        <w:pStyle w:val="Paragraphedeliste"/>
+        <w:jc w:val="both"/>
+      </w:pPr>
+      <w:r>
+        <w:t>•  Figure 12 : Rapport Power BI – analyse des effectifs et des objectifs</w:t>
+      </w:r>
+    </w:p>
+    <w:p>
+      <w:pPr>
+        <w:pStyle w:val="Paragraphedeliste"/>
+        <w:jc w:val="both"/>
+      </w:pPr>
+      <w:r>
+        <w:t>•  Figure 13 : Diagramme de Gantt du projet</w:t>
       </w:r>
     </w:p>
     <w:p>
@@ -2385,7 +2445,7 @@
         <w:jc w:val="both"/>
       </w:pPr>
       <w:r>
-        <w:t>Le stage s’est déroulé au sein de [organisme d’accueil — raison sociale, secteur d’activité, effectif]. [Décrire brièvement l’organisme : son métier, son organisation, ses activités principales et le service d’accueil]. Le projet a été mené pour le compte du domaine bancaire, l’application portant sur la gestion d’un réseau d’agences (cas d’usage BTK Bank).</w:t>
+        <w:t>Le stage s’est déroulé au sein de la BTK – Banque Tuniso-Koweïtienne, une banque tunisienne issue d’un partenariat tuniso-koweïtien, qui propose des services de banque de détail et de financement à travers un réseau d’agences réparties sur le territoire tunisien. [À compléter : date de création, effectif, principaux indicateurs et présentation du service d’accueil]. Le projet a été réalisé au sein de [service / direction d’accueil] et porte sur la gestion du réseau d’agences de la banque.</w:t>
       </w:r>
     </w:p>
     <w:p>
@@ -2397,7 +2457,7 @@
           <w:i/>
           <w:color w:val="808080"/>
         </w:rPr>
-        <w:t>[ Figure : organigramme / logo de l’organisme d’accueil — à insérer ]</w:t>
+        <w:t>[ Figure 1 : Logo de la BTK — capture à insérer ]</w:t>
       </w:r>
     </w:p>
     <w:p>
@@ -3058,11 +3118,51 @@
         <w:jc w:val="center"/>
       </w:pPr>
       <w:r>
+        <w:drawing>
+          <wp:inline xmlns:a="http://schemas.openxmlformats.org/drawingml/2006/main" xmlns:pic="http://schemas.openxmlformats.org/drawingml/2006/picture">
+            <wp:extent cx="5760720" cy="6046308"/>
+            <wp:docPr id="11" name="Picture 11"/>
+            <wp:cNvGraphicFramePr>
+              <a:graphicFrameLocks noChangeAspect="1"/>
+            </wp:cNvGraphicFramePr>
+            <a:graphic>
+              <a:graphicData uri="http://schemas.openxmlformats.org/drawingml/2006/picture">
+                <pic:pic>
+                  <pic:nvPicPr>
+                    <pic:cNvPr id="0" name="usecase.png"/>
+                    <pic:cNvPicPr/>
+                  </pic:nvPicPr>
+                  <pic:blipFill>
+                    <a:blip r:embed="rId12"/>
+                    <a:stretch>
+                      <a:fillRect/>
+                    </a:stretch>
+                  </pic:blipFill>
+                  <pic:spPr>
+                    <a:xfrm>
+                      <a:off x="0" y="0"/>
+                      <a:ext cx="5760720" cy="6046308"/>
+                    </a:xfrm>
+                    <a:prstGeom prst="rect"/>
+                  </pic:spPr>
+                </pic:pic>
+              </a:graphicData>
+            </a:graphic>
+          </wp:inline>
+        </w:drawing>
+      </w:r>
+    </w:p>
+    <w:p>
+      <w:pPr>
+        <w:spacing w:before="40"/>
+        <w:jc w:val="center"/>
+      </w:pPr>
+      <w:r>
         <w:rPr>
           <w:i/>
-          <w:color w:val="808080"/>
-        </w:rPr>
-        <w:t>[ Figure : Diagramme de cas d’utilisation global — à insérer ]</w:t>
+          <w:sz w:val="20"/>
+        </w:rPr>
+        <w:t>Figure 2 : Diagramme de cas d’utilisation global</w:t>
       </w:r>
     </w:p>
     <w:p>
@@ -3238,11 +3338,51 @@
         <w:jc w:val="center"/>
       </w:pPr>
       <w:r>
+        <w:drawing>
+          <wp:inline xmlns:a="http://schemas.openxmlformats.org/drawingml/2006/main" xmlns:pic="http://schemas.openxmlformats.org/drawingml/2006/picture">
+            <wp:extent cx="5760720" cy="6739975"/>
+            <wp:docPr id="12" name="Picture 12"/>
+            <wp:cNvGraphicFramePr>
+              <a:graphicFrameLocks noChangeAspect="1"/>
+            </wp:cNvGraphicFramePr>
+            <a:graphic>
+              <a:graphicData uri="http://schemas.openxmlformats.org/drawingml/2006/picture">
+                <pic:pic>
+                  <pic:nvPicPr>
+                    <pic:cNvPr id="0" name="architecture.png"/>
+                    <pic:cNvPicPr/>
+                  </pic:nvPicPr>
+                  <pic:blipFill>
+                    <a:blip r:embed="rId13"/>
+                    <a:stretch>
+                      <a:fillRect/>
+                    </a:stretch>
+                  </pic:blipFill>
+                  <pic:spPr>
+                    <a:xfrm>
+                      <a:off x="0" y="0"/>
+                      <a:ext cx="5760720" cy="6739975"/>
+                    </a:xfrm>
+                    <a:prstGeom prst="rect"/>
+                  </pic:spPr>
+                </pic:pic>
+              </a:graphicData>
+            </a:graphic>
+          </wp:inline>
+        </w:drawing>
+      </w:r>
+    </w:p>
+    <w:p>
+      <w:pPr>
+        <w:spacing w:before="40"/>
+        <w:jc w:val="center"/>
+      </w:pPr>
+      <w:r>
         <w:rPr>
           <w:i/>
-          <w:color w:val="808080"/>
-        </w:rPr>
-        <w:t>[ Figure : Architecture en couches de l’application — à insérer ]</w:t>
+          <w:sz w:val="20"/>
+        </w:rPr>
+        <w:t>Figure 3 : Architecture en couches de l’application</w:t>
       </w:r>
     </w:p>
     <w:p>
@@ -3275,11 +3415,51 @@
         <w:jc w:val="center"/>
       </w:pPr>
       <w:r>
+        <w:drawing>
+          <wp:inline xmlns:a="http://schemas.openxmlformats.org/drawingml/2006/main" xmlns:pic="http://schemas.openxmlformats.org/drawingml/2006/picture">
+            <wp:extent cx="5760720" cy="4041997"/>
+            <wp:docPr id="13" name="Picture 13"/>
+            <wp:cNvGraphicFramePr>
+              <a:graphicFrameLocks noChangeAspect="1"/>
+            </wp:cNvGraphicFramePr>
+            <a:graphic>
+              <a:graphicData uri="http://schemas.openxmlformats.org/drawingml/2006/picture">
+                <pic:pic>
+                  <pic:nvPicPr>
+                    <pic:cNvPr id="0" name="classes.png"/>
+                    <pic:cNvPicPr/>
+                  </pic:nvPicPr>
+                  <pic:blipFill>
+                    <a:blip r:embed="rId14"/>
+                    <a:stretch>
+                      <a:fillRect/>
+                    </a:stretch>
+                  </pic:blipFill>
+                  <pic:spPr>
+                    <a:xfrm>
+                      <a:off x="0" y="0"/>
+                      <a:ext cx="5760720" cy="4041997"/>
+                    </a:xfrm>
+                    <a:prstGeom prst="rect"/>
+                  </pic:spPr>
+                </pic:pic>
+              </a:graphicData>
+            </a:graphic>
+          </wp:inline>
+        </w:drawing>
+      </w:r>
+    </w:p>
+    <w:p>
+      <w:pPr>
+        <w:spacing w:before="40"/>
+        <w:jc w:val="center"/>
+      </w:pPr>
+      <w:r>
         <w:rPr>
           <w:i/>
-          <w:color w:val="808080"/>
-        </w:rPr>
-        <w:t>[ Figure : Diagramme de classes (modèle métier) — à insérer ]</w:t>
+          <w:sz w:val="20"/>
+        </w:rPr>
+        <w:t>Figure 4 : Diagramme de classes (modèle métier)</w:t>
       </w:r>
     </w:p>
     <w:p>
@@ -3304,11 +3484,51 @@
         <w:jc w:val="center"/>
       </w:pPr>
       <w:r>
+        <w:drawing>
+          <wp:inline xmlns:a="http://schemas.openxmlformats.org/drawingml/2006/main" xmlns:pic="http://schemas.openxmlformats.org/drawingml/2006/picture">
+            <wp:extent cx="5760720" cy="3275176"/>
+            <wp:docPr id="14" name="Picture 14"/>
+            <wp:cNvGraphicFramePr>
+              <a:graphicFrameLocks noChangeAspect="1"/>
+            </wp:cNvGraphicFramePr>
+            <a:graphic>
+              <a:graphicData uri="http://schemas.openxmlformats.org/drawingml/2006/picture">
+                <pic:pic>
+                  <pic:nvPicPr>
+                    <pic:cNvPr id="0" name="sequence.png"/>
+                    <pic:cNvPicPr/>
+                  </pic:nvPicPr>
+                  <pic:blipFill>
+                    <a:blip r:embed="rId15"/>
+                    <a:stretch>
+                      <a:fillRect/>
+                    </a:stretch>
+                  </pic:blipFill>
+                  <pic:spPr>
+                    <a:xfrm>
+                      <a:off x="0" y="0"/>
+                      <a:ext cx="5760720" cy="3275176"/>
+                    </a:xfrm>
+                    <a:prstGeom prst="rect"/>
+                  </pic:spPr>
+                </pic:pic>
+              </a:graphicData>
+            </a:graphic>
+          </wp:inline>
+        </w:drawing>
+      </w:r>
+    </w:p>
+    <w:p>
+      <w:pPr>
+        <w:spacing w:before="40"/>
+        <w:jc w:val="center"/>
+      </w:pPr>
+      <w:r>
         <w:rPr>
           <w:i/>
-          <w:color w:val="808080"/>
-        </w:rPr>
-        <w:t>[ Figure : Diagramme de séquence « Validation d’une demande » — à insérer ]</w:t>
+          <w:sz w:val="20"/>
+        </w:rPr>
+        <w:t>Figure 5 : Diagramme de séquence « Validation d’une demande »</w:t>
       </w:r>
     </w:p>
     <w:p>
@@ -3539,11 +3759,51 @@
         <w:jc w:val="center"/>
       </w:pPr>
       <w:r>
+        <w:drawing>
+          <wp:inline xmlns:a="http://schemas.openxmlformats.org/drawingml/2006/main" xmlns:pic="http://schemas.openxmlformats.org/drawingml/2006/picture">
+            <wp:extent cx="5760720" cy="3404586"/>
+            <wp:docPr id="15" name="Picture 15"/>
+            <wp:cNvGraphicFramePr>
+              <a:graphicFrameLocks noChangeAspect="1"/>
+            </wp:cNvGraphicFramePr>
+            <a:graphic>
+              <a:graphicData uri="http://schemas.openxmlformats.org/drawingml/2006/picture">
+                <pic:pic>
+                  <pic:nvPicPr>
+                    <pic:cNvPr id="0" name="er.png"/>
+                    <pic:cNvPicPr/>
+                  </pic:nvPicPr>
+                  <pic:blipFill>
+                    <a:blip r:embed="rId16"/>
+                    <a:stretch>
+                      <a:fillRect/>
+                    </a:stretch>
+                  </pic:blipFill>
+                  <pic:spPr>
+                    <a:xfrm>
+                      <a:off x="0" y="0"/>
+                      <a:ext cx="5760720" cy="3404586"/>
+                    </a:xfrm>
+                    <a:prstGeom prst="rect"/>
+                  </pic:spPr>
+                </pic:pic>
+              </a:graphicData>
+            </a:graphic>
+          </wp:inline>
+        </w:drawing>
+      </w:r>
+    </w:p>
+    <w:p>
+      <w:pPr>
+        <w:spacing w:before="40"/>
+        <w:jc w:val="center"/>
+      </w:pPr>
+      <w:r>
         <w:rPr>
           <w:i/>
-          <w:color w:val="808080"/>
-        </w:rPr>
-        <w:t>[ Figure : Schéma relationnel de la base de données — à insérer ]</w:t>
+          <w:sz w:val="20"/>
+        </w:rPr>
+        <w:t>Figure 6 : Schéma relationnel de la base de données</w:t>
       </w:r>
     </w:p>
     <w:p>
@@ -3711,11 +3971,51 @@
         <w:jc w:val="center"/>
       </w:pPr>
       <w:r>
+        <w:drawing>
+          <wp:inline xmlns:a="http://schemas.openxmlformats.org/drawingml/2006/main" xmlns:pic="http://schemas.openxmlformats.org/drawingml/2006/picture">
+            <wp:extent cx="5760720" cy="2603917"/>
+            <wp:docPr id="16" name="Picture 16"/>
+            <wp:cNvGraphicFramePr>
+              <a:graphicFrameLocks noChangeAspect="1"/>
+            </wp:cNvGraphicFramePr>
+            <a:graphic>
+              <a:graphicData uri="http://schemas.openxmlformats.org/drawingml/2006/picture">
+                <pic:pic>
+                  <pic:nvPicPr>
+                    <pic:cNvPr id="0" name="bi.png"/>
+                    <pic:cNvPicPr/>
+                  </pic:nvPicPr>
+                  <pic:blipFill>
+                    <a:blip r:embed="rId17"/>
+                    <a:stretch>
+                      <a:fillRect/>
+                    </a:stretch>
+                  </pic:blipFill>
+                  <pic:spPr>
+                    <a:xfrm>
+                      <a:off x="0" y="0"/>
+                      <a:ext cx="5760720" cy="2603917"/>
+                    </a:xfrm>
+                    <a:prstGeom prst="rect"/>
+                  </pic:spPr>
+                </pic:pic>
+              </a:graphicData>
+            </a:graphic>
+          </wp:inline>
+        </w:drawing>
+      </w:r>
+    </w:p>
+    <w:p>
+      <w:pPr>
+        <w:spacing w:before="40"/>
+        <w:jc w:val="center"/>
+      </w:pPr>
+      <w:r>
         <w:rPr>
           <w:i/>
-          <w:color w:val="808080"/>
-        </w:rPr>
-        <w:t>[ Figure : Modèle décisionnel (vues V_BI_*) — à insérer ]</w:t>
+          <w:sz w:val="20"/>
+        </w:rPr>
+        <w:t>Figure 7 : Modèle décisionnel (vues V_BI_*)</w:t>
       </w:r>
     </w:p>
     <w:p>
@@ -4401,7 +4701,7 @@
           <w:i/>
           <w:color w:val="808080"/>
         </w:rPr>
-        <w:t>[ Figure : Page d’authentification — à insérer ]</w:t>
+        <w:t>[ Figure 8 : Page d’authentification — capture à insérer ]</w:t>
       </w:r>
     </w:p>
     <w:p>
@@ -4430,7 +4730,7 @@
           <w:i/>
           <w:color w:val="808080"/>
         </w:rPr>
-        <w:t>[ Figure : Tableau de bord de l’application — à insérer ]</w:t>
+        <w:t>[ Figure 9 : Tableau de bord de l’application — capture à insérer ]</w:t>
       </w:r>
     </w:p>
     <w:p>
@@ -4459,7 +4759,7 @@
           <w:i/>
           <w:color w:val="808080"/>
         </w:rPr>
-        <w:t>[ Figure : Module de gestion des agences / employés / clients — à insérer ]</w:t>
+        <w:t>[ Figure 10 : Module de gestion des agences / employés / clients — capture à insérer ]</w:t>
       </w:r>
     </w:p>
     <w:p>
@@ -4488,7 +4788,7 @@
           <w:i/>
           <w:color w:val="808080"/>
         </w:rPr>
-        <w:t>[ Figure : Gestion des demandes et validation — à insérer ]</w:t>
+        <w:t>[ Figure 11 : Gestion des demandes et validation — capture à insérer ]</w:t>
       </w:r>
     </w:p>
     <w:p>
@@ -4517,7 +4817,7 @@
           <w:i/>
           <w:color w:val="808080"/>
         </w:rPr>
-        <w:t>[ Figure : Rapport Power BI – analyse des effectifs et des objectifs — à insérer ]</w:t>
+        <w:t>[ Figure 12 : Rapport Power BI – analyse des effectifs et des objectifs — capture à insérer ]</w:t>
       </w:r>
     </w:p>
     <w:p>
@@ -4568,11 +4868,51 @@
         <w:jc w:val="center"/>
       </w:pPr>
       <w:r>
+        <w:drawing>
+          <wp:inline xmlns:a="http://schemas.openxmlformats.org/drawingml/2006/main" xmlns:pic="http://schemas.openxmlformats.org/drawingml/2006/picture">
+            <wp:extent cx="5760720" cy="1347623"/>
+            <wp:docPr id="17" name="Picture 17"/>
+            <wp:cNvGraphicFramePr>
+              <a:graphicFrameLocks noChangeAspect="1"/>
+            </wp:cNvGraphicFramePr>
+            <a:graphic>
+              <a:graphicData uri="http://schemas.openxmlformats.org/drawingml/2006/picture">
+                <pic:pic>
+                  <pic:nvPicPr>
+                    <pic:cNvPr id="0" name="gantt.png"/>
+                    <pic:cNvPicPr/>
+                  </pic:nvPicPr>
+                  <pic:blipFill>
+                    <a:blip r:embed="rId18"/>
+                    <a:stretch>
+                      <a:fillRect/>
+                    </a:stretch>
+                  </pic:blipFill>
+                  <pic:spPr>
+                    <a:xfrm>
+                      <a:off x="0" y="0"/>
+                      <a:ext cx="5760720" cy="1347623"/>
+                    </a:xfrm>
+                    <a:prstGeom prst="rect"/>
+                  </pic:spPr>
+                </pic:pic>
+              </a:graphicData>
+            </a:graphic>
+          </wp:inline>
+        </w:drawing>
+      </w:r>
+    </w:p>
+    <w:p>
+      <w:pPr>
+        <w:spacing w:before="40"/>
+        <w:jc w:val="center"/>
+      </w:pPr>
+      <w:r>
         <w:rPr>
           <w:i/>
-          <w:color w:val="808080"/>
-        </w:rPr>
-        <w:t>[ Figure : Diagramme de Gantt du projet — à insérer ]</w:t>
+          <w:sz w:val="20"/>
+        </w:rPr>
+        <w:t>Figure 13 : Diagramme de Gantt du projet</w:t>
       </w:r>
     </w:p>
     <w:p>

</xml_diff>

<commit_message>
Add BTK logo and flesh out the host-organization presentation (§1.2)
- Embed the BTK Bank logo (Fig 1), extracted from the reference document.
- Rewrite §1.2 "Présentation de l'organisme d'accueil" as an original synthesis
  about the BTK – Banque Tuniso-Koweïtienne: fiche signalétique, aperçu
  historique, structure du capital, activités et services, réseau et cadre du
  stage (with chronology and fact tables).
- Refresh the figure list and finalization guide accordingly.

Co-Authored-By: Claude Opus 4.8 <noreply@anthropic.com>
Claude-Session: https://claude.ai/code/session_01XrCEv79rD628gYBfC2XWx6
</commit_message>
<xml_diff>
--- a/rapport/Rapport_de_stage_PFE_gestion-agences.docx
+++ b/rapport/Rapport_de_stage_PFE_gestion-agences.docx
@@ -2445,53 +2445,59 @@
         <w:jc w:val="both"/>
       </w:pPr>
       <w:r>
-        <w:t>Le stage s’est déroulé au sein de la BTK – Banque Tuniso-Koweïtienne, une banque tunisienne issue d’un partenariat tuniso-koweïtien, qui propose des services de banque de détail et de financement à travers un réseau d’agences réparties sur le territoire tunisien. [À compléter : date de création, effectif, principaux indicateurs et présentation du service d’accueil]. Le projet a été réalisé au sein de [service / direction d’accueil] et porte sur la gestion du réseau d’agences de la banque.</w:t>
-      </w:r>
-    </w:p>
-    <w:p>
-      <w:pPr>
+        <w:t>La Banque Tuniso-Koweïtienne (BTK Bank) est une banque universelle de droit tunisien, créée le 25 février 1981 dans le cadre d’une convention de coopération bilatérale entre la Tunisie et le Koweït. Constituée en société anonyme et régie par la loi bancaire n° 2016-48, elle dispose d’un capital social de 200 millions de dinars et a son siège social à Tunis. À travers un réseau d’agences couvrant l’ensemble du territoire tunisien, la BTK accompagne aussi bien les particuliers que les entreprises au moyen d’une offre complète de produits de financement, d’épargne et de services internationaux.</w:t>
+      </w:r>
+    </w:p>
+    <w:p>
+      <w:pPr>
+        <w:jc w:val="center"/>
+      </w:pPr>
+      <w:r>
+        <w:drawing>
+          <wp:inline xmlns:a="http://schemas.openxmlformats.org/drawingml/2006/main" xmlns:pic="http://schemas.openxmlformats.org/drawingml/2006/picture">
+            <wp:extent cx="1280160" cy="1335819"/>
+            <wp:docPr id="11" name="Picture 11"/>
+            <wp:cNvGraphicFramePr>
+              <a:graphicFrameLocks noChangeAspect="1"/>
+            </wp:cNvGraphicFramePr>
+            <a:graphic>
+              <a:graphicData uri="http://schemas.openxmlformats.org/drawingml/2006/picture">
+                <pic:pic>
+                  <pic:nvPicPr>
+                    <pic:cNvPr id="0" name="btk_logo.png"/>
+                    <pic:cNvPicPr/>
+                  </pic:nvPicPr>
+                  <pic:blipFill>
+                    <a:blip r:embed="rId12"/>
+                    <a:stretch>
+                      <a:fillRect/>
+                    </a:stretch>
+                  </pic:blipFill>
+                  <pic:spPr>
+                    <a:xfrm>
+                      <a:off x="0" y="0"/>
+                      <a:ext cx="1280160" cy="1335819"/>
+                    </a:xfrm>
+                    <a:prstGeom prst="rect"/>
+                  </pic:spPr>
+                </pic:pic>
+              </a:graphicData>
+            </a:graphic>
+          </wp:inline>
+        </w:drawing>
+      </w:r>
+    </w:p>
+    <w:p>
+      <w:pPr>
+        <w:spacing w:before="40"/>
         <w:jc w:val="center"/>
       </w:pPr>
       <w:r>
         <w:rPr>
           <w:i/>
-          <w:color w:val="808080"/>
-        </w:rPr>
-        <w:t>[ Figure 1 : Logo de la BTK — capture à insérer ]</w:t>
-      </w:r>
-    </w:p>
-    <w:p>
-      <w:pPr>
-        <w:pStyle w:val="Titre2"/>
-      </w:pPr>
-      <w:r>
-        <w:t>1.3  Contexte et objectifs du stage</w:t>
-      </w:r>
-    </w:p>
-    <w:p>
-      <w:pPr>
-        <w:spacing w:after="120"/>
-        <w:jc w:val="both"/>
-      </w:pPr>
-      <w:r>
-        <w:t>Le réseau d’agences d’une banque génère un volume important d’informations relatives aux agences, aux collaborateurs, aux clients et aux objectifs commerciaux. La gestion de ces informations à l’aide d’outils bureautiques dispersés (fichiers tableurs, documents isolés) atteint rapidement ses limites en matière de cohérence, de traçabilité et de restitution.</w:t>
-      </w:r>
-    </w:p>
-    <w:p>
-      <w:pPr>
-        <w:spacing w:after="120"/>
-        <w:jc w:val="both"/>
-      </w:pPr>
-      <w:r>
-        <w:t>L’objectif du stage est double : (i) concevoir une application web centralisée pour la gestion opérationnelle du réseau d’agences et (ii) mettre en place un volet décisionnel permettant de transformer les données opérationnelles en indicateurs exploitables par les responsables.</w:t>
-      </w:r>
-    </w:p>
-    <w:p>
-      <w:pPr>
-        <w:pStyle w:val="Titre2"/>
-      </w:pPr>
-      <w:r>
-        <w:t>1.4  Étude de l’existant</w:t>
+          <w:sz w:val="20"/>
+        </w:rPr>
+        <w:t>Figure 1 : Logo de la BTK</w:t>
       </w:r>
     </w:p>
     <w:p>
@@ -2499,193 +2505,7 @@
         <w:pStyle w:val="Titre3"/>
       </w:pPr>
       <w:r>
-        <w:t>1.4.1  Description de l’existant</w:t>
-      </w:r>
-    </w:p>
-    <w:p>
-      <w:pPr>
-        <w:spacing w:after="120"/>
-        <w:jc w:val="both"/>
-      </w:pPr>
-      <w:r>
-        <w:t>La gestion actuelle repose en grande partie sur des traitements manuels et des fichiers non centralisés. Les données relatives aux agences, aux employés et aux clients sont saisies et conservées de manière hétérogène, et les demandes de création ou de modification circulent par des canaux informels (courriel, documents papier).</w:t>
-      </w:r>
-    </w:p>
-    <w:p>
-      <w:pPr>
-        <w:pStyle w:val="Titre3"/>
-      </w:pPr>
-      <w:r>
-        <w:t>1.4.2  Critique de l’existant</w:t>
-      </w:r>
-    </w:p>
-    <w:p>
-      <w:pPr>
-        <w:spacing w:after="120"/>
-        <w:jc w:val="both"/>
-      </w:pPr>
-      <w:r>
-        <w:t>Cette organisation présente plusieurs limites :</w:t>
-      </w:r>
-    </w:p>
-    <w:p>
-      <w:pPr>
-        <w:pStyle w:val="Paragraphedeliste"/>
-        <w:jc w:val="both"/>
-      </w:pPr>
-      <w:r>
-        <w:t>•  Dispersion et redondance des données, source d’incohérences.</w:t>
-      </w:r>
-    </w:p>
-    <w:p>
-      <w:pPr>
-        <w:pStyle w:val="Paragraphedeliste"/>
-        <w:jc w:val="both"/>
-      </w:pPr>
-      <w:r>
-        <w:t>•  Absence de circuit de validation formalisé pour les opérations sensibles.</w:t>
-      </w:r>
-    </w:p>
-    <w:p>
-      <w:pPr>
-        <w:pStyle w:val="Paragraphedeliste"/>
-        <w:jc w:val="both"/>
-      </w:pPr>
-      <w:r>
-        <w:t>•  Faible traçabilité des actions et des décisions.</w:t>
-      </w:r>
-    </w:p>
-    <w:p>
-      <w:pPr>
-        <w:pStyle w:val="Paragraphedeliste"/>
-        <w:jc w:val="both"/>
-      </w:pPr>
-      <w:r>
-        <w:t>•  Difficulté à produire des indicateurs consolidés pour le pilotage.</w:t>
-      </w:r>
-    </w:p>
-    <w:p>
-      <w:pPr>
-        <w:pStyle w:val="Paragraphedeliste"/>
-        <w:jc w:val="both"/>
-      </w:pPr>
-      <w:r>
-        <w:t>•  Sécurité et gestion des droits d’accès insuffisamment maîtrisées.</w:t>
-      </w:r>
-    </w:p>
-    <w:p>
-      <w:pPr>
-        <w:pStyle w:val="Titre2"/>
-      </w:pPr>
-      <w:r>
-        <w:t>1.5  Problématique</w:t>
-      </w:r>
-    </w:p>
-    <w:p>
-      <w:pPr>
-        <w:spacing w:after="120"/>
-        <w:jc w:val="both"/>
-      </w:pPr>
-      <w:r>
-        <w:t>Comment centraliser et fiabiliser la gestion du réseau d’agences bancaires, tout en encadrant les opérations sensibles par des circuits de validation, et comment exploiter les données ainsi structurées pour fournir aux responsables des indicateurs d’aide à la décision ?</w:t>
-      </w:r>
-    </w:p>
-    <w:p>
-      <w:pPr>
-        <w:pStyle w:val="Titre2"/>
-      </w:pPr>
-      <w:r>
-        <w:t>1.6  Solution proposée</w:t>
-      </w:r>
-    </w:p>
-    <w:p>
-      <w:pPr>
-        <w:spacing w:after="120"/>
-        <w:jc w:val="both"/>
-      </w:pPr>
-      <w:r>
-        <w:t>La solution consiste en une application web centralisée, structurée autour d’une base de données relationnelle Oracle, qui couvre la gestion des agences, des employés, des clients et des objectifs, et qui formalise les demandes de création et de modification via des workflows de validation. Un volet décisionnel complète le dispositif : des vues analytiques alimentent Microsoft Power BI, et un tableau de bord embarqué restitue les indicateurs clés directement dans l’application.</w:t>
-      </w:r>
-    </w:p>
-    <w:p>
-      <w:pPr>
-        <w:pStyle w:val="Titre2"/>
-      </w:pPr>
-      <w:r>
-        <w:t>1.7  Méthodologie de travail</w:t>
-      </w:r>
-    </w:p>
-    <w:p>
-      <w:pPr>
-        <w:spacing w:after="120"/>
-        <w:jc w:val="both"/>
-      </w:pPr>
-      <w:r>
-        <w:t>Le projet a été conduit selon une démarche itérative et incrémentale, inspirée des principes agiles. Chaque module (gestion des agences, des employés, des clients, des objectifs, puis le volet décisionnel) a été spécifié, conçu, développé puis testé avant l’intégration du suivant. Le langage de modélisation UML a servi de support à l’analyse et à la conception.</w:t>
-      </w:r>
-    </w:p>
-    <w:p>
-      <w:pPr>
-        <w:pStyle w:val="Titre2"/>
-      </w:pPr>
-      <w:r>
-        <w:t>1.8  Conclusion</w:t>
-      </w:r>
-    </w:p>
-    <w:p>
-      <w:pPr>
-        <w:spacing w:after="120"/>
-        <w:jc w:val="both"/>
-      </w:pPr>
-      <w:r>
-        <w:t>Après avoir situé le projet et dégagé sa problématique, le chapitre suivant formalise les besoins fonctionnels et non fonctionnels de la solution.</w:t>
-      </w:r>
-    </w:p>
-    <w:p>
-      <w:r>
-        <w:br w:type="page"/>
-      </w:r>
-    </w:p>
-    <w:p>
-      <w:pPr>
-        <w:pStyle w:val="Titre1"/>
-      </w:pPr>
-      <w:r>
-        <w:t>Chapitre 2 : Analyse et spécification des besoins</w:t>
-      </w:r>
-    </w:p>
-    <w:p>
-      <w:pPr>
-        <w:pStyle w:val="Titre2"/>
-      </w:pPr>
-      <w:r>
-        <w:t>2.1  Introduction</w:t>
-      </w:r>
-    </w:p>
-    <w:p>
-      <w:pPr>
-        <w:spacing w:after="120"/>
-        <w:jc w:val="both"/>
-      </w:pPr>
-      <w:r>
-        <w:t>Ce chapitre identifie les acteurs du système et spécifie les besoins fonctionnels et non fonctionnels, illustrés par les principaux cas d’utilisation.</w:t>
-      </w:r>
-    </w:p>
-    <w:p>
-      <w:pPr>
-        <w:pStyle w:val="Titre2"/>
-      </w:pPr>
-      <w:r>
-        <w:t>2.2  Identification des acteurs</w:t>
-      </w:r>
-    </w:p>
-    <w:p>
-      <w:pPr>
-        <w:spacing w:after="120"/>
-        <w:jc w:val="both"/>
-      </w:pPr>
-      <w:r>
-        <w:t>Trois profils principaux interagissent avec l’application, conformément aux rôles gérés par le module de sécurité :</w:t>
+        <w:t>1.2.1  Fiche signalétique</w:t>
       </w:r>
     </w:p>
     <w:tbl>
@@ -2717,7 +2537,7 @@
               <w:rPr>
                 <w:b/>
               </w:rPr>
-              <w:t>Acteur</w:t>
+              <w:t>Élément</w:t>
             </w:r>
           </w:p>
         </w:tc>
@@ -2731,73 +2551,227 @@
               <w:rPr>
                 <w:b/>
               </w:rPr>
-              <w:t>Description</w:t>
-            </w:r>
-          </w:p>
-        </w:tc>
-      </w:tr>
-      <w:tr>
-        <w:tc>
-          <w:tcPr>
-            <w:tcW w:type="dxa" w:w="4536"/>
-          </w:tcPr>
-          <w:p>
-            <w:r>
-              <w:t>Administrateur (ADMIN)</w:t>
-            </w:r>
-          </w:p>
-        </w:tc>
-        <w:tc>
-          <w:tcPr>
-            <w:tcW w:type="dxa" w:w="4536"/>
-          </w:tcPr>
-          <w:p>
-            <w:r>
-              <w:t>Gère les agences, les employés et les clients ; valide les demandes de création de clients et d’employés ; supervise l’activité.</w:t>
-            </w:r>
-          </w:p>
-        </w:tc>
-      </w:tr>
-      <w:tr>
-        <w:tc>
-          <w:tcPr>
-            <w:tcW w:type="dxa" w:w="4536"/>
-          </w:tcPr>
-          <w:p>
-            <w:r>
-              <w:t>Directeur commercial (DIRECTEUR_COMMERCIAL)</w:t>
-            </w:r>
-          </w:p>
-        </w:tc>
-        <w:tc>
-          <w:tcPr>
-            <w:tcW w:type="dxa" w:w="4536"/>
-          </w:tcPr>
-          <w:p>
-            <w:r>
-              <w:t>Soumet les demandes de création (clients, employés) ; valide les demandes de modification des données des employés.</w:t>
-            </w:r>
-          </w:p>
-        </w:tc>
-      </w:tr>
-      <w:tr>
-        <w:tc>
-          <w:tcPr>
-            <w:tcW w:type="dxa" w:w="4536"/>
-          </w:tcPr>
-          <w:p>
-            <w:r>
-              <w:t>Utilisateur (USER)</w:t>
-            </w:r>
-          </w:p>
-        </w:tc>
-        <w:tc>
-          <w:tcPr>
-            <w:tcW w:type="dxa" w:w="4536"/>
-          </w:tcPr>
-          <w:p>
-            <w:r>
-              <w:t>Consulte les données autorisées et soumet des demandes de modification concernant ses propres informations.</w:t>
+              <w:t>Renseignement</w:t>
+            </w:r>
+          </w:p>
+        </w:tc>
+      </w:tr>
+      <w:tr>
+        <w:tc>
+          <w:tcPr>
+            <w:tcW w:type="dxa" w:w="4536"/>
+          </w:tcPr>
+          <w:p>
+            <w:r>
+              <w:t>Dénomination sociale</w:t>
+            </w:r>
+          </w:p>
+        </w:tc>
+        <w:tc>
+          <w:tcPr>
+            <w:tcW w:type="dxa" w:w="4536"/>
+          </w:tcPr>
+          <w:p>
+            <w:r>
+              <w:t>Banque Tuniso-Koweïtienne (BTK Bank)</w:t>
+            </w:r>
+          </w:p>
+        </w:tc>
+      </w:tr>
+      <w:tr>
+        <w:tc>
+          <w:tcPr>
+            <w:tcW w:type="dxa" w:w="4536"/>
+          </w:tcPr>
+          <w:p>
+            <w:r>
+              <w:t>Forme juridique</w:t>
+            </w:r>
+          </w:p>
+        </w:tc>
+        <w:tc>
+          <w:tcPr>
+            <w:tcW w:type="dxa" w:w="4536"/>
+          </w:tcPr>
+          <w:p>
+            <w:r>
+              <w:t>Société Anonyme (S.A.)</w:t>
+            </w:r>
+          </w:p>
+        </w:tc>
+      </w:tr>
+      <w:tr>
+        <w:tc>
+          <w:tcPr>
+            <w:tcW w:type="dxa" w:w="4536"/>
+          </w:tcPr>
+          <w:p>
+            <w:r>
+              <w:t>Date de création</w:t>
+            </w:r>
+          </w:p>
+        </w:tc>
+        <w:tc>
+          <w:tcPr>
+            <w:tcW w:type="dxa" w:w="4536"/>
+          </w:tcPr>
+          <w:p>
+            <w:r>
+              <w:t>25 février 1981</w:t>
+            </w:r>
+          </w:p>
+        </w:tc>
+      </w:tr>
+      <w:tr>
+        <w:tc>
+          <w:tcPr>
+            <w:tcW w:type="dxa" w:w="4536"/>
+          </w:tcPr>
+          <w:p>
+            <w:r>
+              <w:t>Capital social</w:t>
+            </w:r>
+          </w:p>
+        </w:tc>
+        <w:tc>
+          <w:tcPr>
+            <w:tcW w:type="dxa" w:w="4536"/>
+          </w:tcPr>
+          <w:p>
+            <w:r>
+              <w:t>200 000 000 DT (2 000 000 actions de 100 DT)</w:t>
+            </w:r>
+          </w:p>
+        </w:tc>
+      </w:tr>
+      <w:tr>
+        <w:tc>
+          <w:tcPr>
+            <w:tcW w:type="dxa" w:w="4536"/>
+          </w:tcPr>
+          <w:p>
+            <w:r>
+              <w:t>Siège social</w:t>
+            </w:r>
+          </w:p>
+        </w:tc>
+        <w:tc>
+          <w:tcPr>
+            <w:tcW w:type="dxa" w:w="4536"/>
+          </w:tcPr>
+          <w:p>
+            <w:r>
+              <w:t>10 bis, Avenue Mohamed V, 1001 Tunis</w:t>
+            </w:r>
+          </w:p>
+        </w:tc>
+      </w:tr>
+      <w:tr>
+        <w:tc>
+          <w:tcPr>
+            <w:tcW w:type="dxa" w:w="4536"/>
+          </w:tcPr>
+          <w:p>
+            <w:r>
+              <w:t>Secteur d’activité</w:t>
+            </w:r>
+          </w:p>
+        </w:tc>
+        <w:tc>
+          <w:tcPr>
+            <w:tcW w:type="dxa" w:w="4536"/>
+          </w:tcPr>
+          <w:p>
+            <w:r>
+              <w:t>Banque universelle</w:t>
+            </w:r>
+          </w:p>
+        </w:tc>
+      </w:tr>
+      <w:tr>
+        <w:tc>
+          <w:tcPr>
+            <w:tcW w:type="dxa" w:w="4536"/>
+          </w:tcPr>
+          <w:p>
+            <w:r>
+              <w:t>Actionnaire de référence</w:t>
+            </w:r>
+          </w:p>
+        </w:tc>
+        <w:tc>
+          <w:tcPr>
+            <w:tcW w:type="dxa" w:w="4536"/>
+          </w:tcPr>
+          <w:p>
+            <w:r>
+              <w:t>Groupe Elloumi (60 %)</w:t>
+            </w:r>
+          </w:p>
+        </w:tc>
+      </w:tr>
+      <w:tr>
+        <w:tc>
+          <w:tcPr>
+            <w:tcW w:type="dxa" w:w="4536"/>
+          </w:tcPr>
+          <w:p>
+            <w:r>
+              <w:t>Réseau</w:t>
+            </w:r>
+          </w:p>
+        </w:tc>
+        <w:tc>
+          <w:tcPr>
+            <w:tcW w:type="dxa" w:w="4536"/>
+          </w:tcPr>
+          <w:p>
+            <w:r>
+              <w:t>5 directions régionales, 6 succursales, 45 agences</w:t>
+            </w:r>
+          </w:p>
+        </w:tc>
+      </w:tr>
+      <w:tr>
+        <w:tc>
+          <w:tcPr>
+            <w:tcW w:type="dxa" w:w="4536"/>
+          </w:tcPr>
+          <w:p>
+            <w:r>
+              <w:t>Effectif (2024)</w:t>
+            </w:r>
+          </w:p>
+        </w:tc>
+        <w:tc>
+          <w:tcPr>
+            <w:tcW w:type="dxa" w:w="4536"/>
+          </w:tcPr>
+          <w:p>
+            <w:r>
+              <w:t>≈ 400 collaborateurs</w:t>
+            </w:r>
+          </w:p>
+        </w:tc>
+      </w:tr>
+      <w:tr>
+        <w:tc>
+          <w:tcPr>
+            <w:tcW w:type="dxa" w:w="4536"/>
+          </w:tcPr>
+          <w:p>
+            <w:r>
+              <w:t>Site web</w:t>
+            </w:r>
+          </w:p>
+        </w:tc>
+        <w:tc>
+          <w:tcPr>
+            <w:tcW w:type="dxa" w:w="4536"/>
+          </w:tcPr>
+          <w:p>
+            <w:r>
+              <w:t>www.btknet.com</w:t>
             </w:r>
           </w:p>
         </w:tc>
@@ -2808,10 +2782,10 @@
     </w:p>
     <w:p>
       <w:pPr>
-        <w:pStyle w:val="Titre2"/>
-      </w:pPr>
-      <w:r>
-        <w:t>2.3  Besoins fonctionnels</w:t>
+        <w:pStyle w:val="Titre3"/>
+      </w:pPr>
+      <w:r>
+        <w:t>1.2.2  Aperçu historique</w:t>
       </w:r>
     </w:p>
     <w:p>
@@ -2820,96 +2794,7 @@
         <w:jc w:val="both"/>
       </w:pPr>
       <w:r>
-        <w:t>Le système doit permettre :</w:t>
-      </w:r>
-    </w:p>
-    <w:p>
-      <w:pPr>
-        <w:pStyle w:val="Paragraphedeliste"/>
-        <w:jc w:val="both"/>
-      </w:pPr>
-      <w:r>
-        <w:t>•  L’authentification sécurisée et la gestion des rôles et des droits d’accès.</w:t>
-      </w:r>
-    </w:p>
-    <w:p>
-      <w:pPr>
-        <w:pStyle w:val="Paragraphedeliste"/>
-        <w:jc w:val="both"/>
-      </w:pPr>
-      <w:r>
-        <w:t>•  La gestion des agences (création, consultation, mise à jour, suppression).</w:t>
-      </w:r>
-    </w:p>
-    <w:p>
-      <w:pPr>
-        <w:pStyle w:val="Paragraphedeliste"/>
-        <w:jc w:val="both"/>
-      </w:pPr>
-      <w:r>
-        <w:t>•  La gestion des employés (effectifs), incluant leur rattachement aux agences.</w:t>
-      </w:r>
-    </w:p>
-    <w:p>
-      <w:pPr>
-        <w:pStyle w:val="Paragraphedeliste"/>
-        <w:jc w:val="both"/>
-      </w:pPr>
-      <w:r>
-        <w:t>•  La gestion des clients (portefeuille), avec typologie et secteur d’activité.</w:t>
-      </w:r>
-    </w:p>
-    <w:p>
-      <w:pPr>
-        <w:pStyle w:val="Paragraphedeliste"/>
-        <w:jc w:val="both"/>
-      </w:pPr>
-      <w:r>
-        <w:t>•  La gestion des objectifs commerciaux et le suivi de la production.</w:t>
-      </w:r>
-    </w:p>
-    <w:p>
-      <w:pPr>
-        <w:pStyle w:val="Paragraphedeliste"/>
-        <w:jc w:val="both"/>
-      </w:pPr>
-      <w:r>
-        <w:t>•  La soumission et la validation des demandes (clients, employés, modifications) selon un cycle EN_ATTENTE → EN_COURS → EFFECTUÉ / REFUSÉ.</w:t>
-      </w:r>
-    </w:p>
-    <w:p>
-      <w:pPr>
-        <w:pStyle w:val="Paragraphedeliste"/>
-        <w:jc w:val="both"/>
-      </w:pPr>
-      <w:r>
-        <w:t>•  La notification des demandes en attente selon le rôle de l’utilisateur.</w:t>
-      </w:r>
-    </w:p>
-    <w:p>
-      <w:pPr>
-        <w:pStyle w:val="Paragraphedeliste"/>
-        <w:jc w:val="both"/>
-      </w:pPr>
-      <w:r>
-        <w:t>•  La journalisation des actions (audit) et l’affichage de l’activité récente.</w:t>
-      </w:r>
-    </w:p>
-    <w:p>
-      <w:pPr>
-        <w:pStyle w:val="Paragraphedeliste"/>
-        <w:jc w:val="both"/>
-      </w:pPr>
-      <w:r>
-        <w:t>•  La restitution d’indicateurs via un tableau de bord et via Power BI.</w:t>
-      </w:r>
-    </w:p>
-    <w:p>
-      <w:pPr>
-        <w:pStyle w:val="Titre2"/>
-      </w:pPr>
-      <w:r>
-        <w:t>2.4  Besoins non fonctionnels</w:t>
+        <w:t>Issue de la convention bilatérale signée en 1980 entre la Tunisie et le Koweït, la BTK voit le jour en 1981 avec une vocation initiale de financement des projets d’investissement à forte valeur ajoutée. Elle obtient en 2004 son agrément de banque universelle, élargissant son activité à la banque de détail, au financement des entreprises et aux opérations de marché. Son actionnariat connaît ensuite plusieurs évolutions : l’entrée du groupe français BPCE en 2008, le doublement de son capital en 2017, puis l’acquisition de la participation de référence par le Groupe Elloumi en 2021. La banque conduit depuis un plan de transformation axé sur la consolidation financière et la digitalisation de ses services.</w:t>
       </w:r>
     </w:p>
     <w:tbl>
@@ -2941,7 +2826,528 @@
               <w:rPr>
                 <w:b/>
               </w:rPr>
-              <w:t>Besoin</w:t>
+              <w:t>Année</w:t>
+            </w:r>
+          </w:p>
+        </w:tc>
+        <w:tc>
+          <w:tcPr>
+            <w:tcW w:type="dxa" w:w="4536"/>
+          </w:tcPr>
+          <w:p>
+            <w:r/>
+            <w:r>
+              <w:rPr>
+                <w:b/>
+              </w:rPr>
+              <w:t>Événement marquant</w:t>
+            </w:r>
+          </w:p>
+        </w:tc>
+      </w:tr>
+      <w:tr>
+        <w:tc>
+          <w:tcPr>
+            <w:tcW w:type="dxa" w:w="4536"/>
+          </w:tcPr>
+          <w:p>
+            <w:r>
+              <w:t>1980</w:t>
+            </w:r>
+          </w:p>
+        </w:tc>
+        <w:tc>
+          <w:tcPr>
+            <w:tcW w:type="dxa" w:w="4536"/>
+          </w:tcPr>
+          <w:p>
+            <w:r>
+              <w:t>Signature de la convention bilatérale Tunisie–Koweït</w:t>
+            </w:r>
+          </w:p>
+        </w:tc>
+      </w:tr>
+      <w:tr>
+        <w:tc>
+          <w:tcPr>
+            <w:tcW w:type="dxa" w:w="4536"/>
+          </w:tcPr>
+          <w:p>
+            <w:r>
+              <w:t>1981</w:t>
+            </w:r>
+          </w:p>
+        </w:tc>
+        <w:tc>
+          <w:tcPr>
+            <w:tcW w:type="dxa" w:w="4536"/>
+          </w:tcPr>
+          <w:p>
+            <w:r>
+              <w:t>Création de la Banque Tuniso-Koweïtienne</w:t>
+            </w:r>
+          </w:p>
+        </w:tc>
+      </w:tr>
+      <w:tr>
+        <w:tc>
+          <w:tcPr>
+            <w:tcW w:type="dxa" w:w="4536"/>
+          </w:tcPr>
+          <w:p>
+            <w:r>
+              <w:t>2004</w:t>
+            </w:r>
+          </w:p>
+        </w:tc>
+        <w:tc>
+          <w:tcPr>
+            <w:tcW w:type="dxa" w:w="4536"/>
+          </w:tcPr>
+          <w:p>
+            <w:r>
+              <w:t>Obtention de la licence de banque universelle</w:t>
+            </w:r>
+          </w:p>
+        </w:tc>
+      </w:tr>
+      <w:tr>
+        <w:tc>
+          <w:tcPr>
+            <w:tcW w:type="dxa" w:w="4536"/>
+          </w:tcPr>
+          <w:p>
+            <w:r>
+              <w:t>2008</w:t>
+            </w:r>
+          </w:p>
+        </w:tc>
+        <w:tc>
+          <w:tcPr>
+            <w:tcW w:type="dxa" w:w="4536"/>
+          </w:tcPr>
+          <w:p>
+            <w:r>
+              <w:t>Entrée du groupe BPCE dans le capital</w:t>
+            </w:r>
+          </w:p>
+        </w:tc>
+      </w:tr>
+      <w:tr>
+        <w:tc>
+          <w:tcPr>
+            <w:tcW w:type="dxa" w:w="4536"/>
+          </w:tcPr>
+          <w:p>
+            <w:r>
+              <w:t>2017</w:t>
+            </w:r>
+          </w:p>
+        </w:tc>
+        <w:tc>
+          <w:tcPr>
+            <w:tcW w:type="dxa" w:w="4536"/>
+          </w:tcPr>
+          <w:p>
+            <w:r>
+              <w:t>Augmentation du capital de 100 à 200 MDT</w:t>
+            </w:r>
+          </w:p>
+        </w:tc>
+      </w:tr>
+      <w:tr>
+        <w:tc>
+          <w:tcPr>
+            <w:tcW w:type="dxa" w:w="4536"/>
+          </w:tcPr>
+          <w:p>
+            <w:r>
+              <w:t>2021</w:t>
+            </w:r>
+          </w:p>
+        </w:tc>
+        <w:tc>
+          <w:tcPr>
+            <w:tcW w:type="dxa" w:w="4536"/>
+          </w:tcPr>
+          <w:p>
+            <w:r>
+              <w:t>Acquisition de la participation de référence par le Groupe Elloumi</w:t>
+            </w:r>
+          </w:p>
+        </w:tc>
+      </w:tr>
+      <w:tr>
+        <w:tc>
+          <w:tcPr>
+            <w:tcW w:type="dxa" w:w="4536"/>
+          </w:tcPr>
+          <w:p>
+            <w:r>
+              <w:t>2024–2025</w:t>
+            </w:r>
+          </w:p>
+        </w:tc>
+        <w:tc>
+          <w:tcPr>
+            <w:tcW w:type="dxa" w:w="4536"/>
+          </w:tcPr>
+          <w:p>
+            <w:r>
+              <w:t>Poursuite du plan de transformation et redressement du résultat</w:t>
+            </w:r>
+          </w:p>
+        </w:tc>
+      </w:tr>
+    </w:tbl>
+    <w:p>
+      <w:pPr/>
+    </w:p>
+    <w:p>
+      <w:pPr>
+        <w:pStyle w:val="Titre3"/>
+      </w:pPr>
+      <w:r>
+        <w:t>1.2.3  Structure du capital</w:t>
+      </w:r>
+    </w:p>
+    <w:p>
+      <w:pPr>
+        <w:spacing w:after="120"/>
+        <w:jc w:val="both"/>
+      </w:pPr>
+      <w:r>
+        <w:t>Le capital de la banque est détenu par le Groupe Elloumi, actionnaire de référence (60 %), aux côtés de l’État tunisien (20 %) et de la Kuwait Investment Authority (20 %), cofondateur historique de l’institution.</w:t>
+      </w:r>
+    </w:p>
+    <w:p>
+      <w:pPr>
+        <w:pStyle w:val="Titre3"/>
+      </w:pPr>
+      <w:r>
+        <w:t>1.2.4  Activités et services</w:t>
+      </w:r>
+    </w:p>
+    <w:p>
+      <w:pPr>
+        <w:spacing w:after="120"/>
+        <w:jc w:val="both"/>
+      </w:pPr>
+      <w:r>
+        <w:t>En tant que banque universelle, la BTK propose une gamme étendue de produits et de services organisés autour de quatre grands métiers :</w:t>
+      </w:r>
+    </w:p>
+    <w:p>
+      <w:pPr>
+        <w:pStyle w:val="Paragraphedeliste"/>
+        <w:jc w:val="both"/>
+      </w:pPr>
+      <w:r>
+        <w:t>•  Banque de détail : comptes courants et d’épargne, cartes nationales et internationales (Visa, Mastercard), crédits à la consommation et immobiliers, produits d’assurance et banque digitale via la plateforme BTKNet.</w:t>
+      </w:r>
+    </w:p>
+    <w:p>
+      <w:pPr>
+        <w:pStyle w:val="Paragraphedeliste"/>
+        <w:jc w:val="both"/>
+      </w:pPr>
+      <w:r>
+        <w:t>•  Banque des entreprises : crédits d’investissement et de fonctionnement, financement du commerce extérieur, gestion de trésorerie et conseil financier.</w:t>
+      </w:r>
+    </w:p>
+    <w:p>
+      <w:pPr>
+        <w:pStyle w:val="Paragraphedeliste"/>
+        <w:jc w:val="both"/>
+      </w:pPr>
+      <w:r>
+        <w:t>•  Opérations internationales et de marché : opérations de change au comptant et à terme, couverture du risque de change et placements de trésorerie.</w:t>
+      </w:r>
+    </w:p>
+    <w:p>
+      <w:pPr>
+        <w:pStyle w:val="Paragraphedeliste"/>
+        <w:jc w:val="both"/>
+      </w:pPr>
+      <w:r>
+        <w:t>•  Services spécialisés : banque d’affaires, banque privée, bancassurance et intermédiation boursière (BTK Conseil).</w:t>
+      </w:r>
+    </w:p>
+    <w:p>
+      <w:pPr>
+        <w:pStyle w:val="Titre3"/>
+      </w:pPr>
+      <w:r>
+        <w:t>1.2.5  Réseau et cadre du stage</w:t>
+      </w:r>
+    </w:p>
+    <w:p>
+      <w:pPr>
+        <w:spacing w:after="120"/>
+        <w:jc w:val="both"/>
+      </w:pPr>
+      <w:r>
+        <w:t>La BTK s’appuie sur un réseau commercial structuré en 5 directions régionales, 6 succursales et 45 agences réparties sur le territoire tunisien, animé par un effectif d’environ 400 collaborateurs. Le présent projet s’inscrit dans la gestion de ce réseau : c’est précisément l’administration des agences, des effectifs, du portefeuille clients et des objectifs commerciaux qui constitue le périmètre fonctionnel de l’application réalisée. [Préciser le service / la direction d’accueil au sein de la BTK].</w:t>
+      </w:r>
+    </w:p>
+    <w:p>
+      <w:pPr>
+        <w:pStyle w:val="Titre2"/>
+      </w:pPr>
+      <w:r>
+        <w:t>1.3  Contexte et objectifs du stage</w:t>
+      </w:r>
+    </w:p>
+    <w:p>
+      <w:pPr>
+        <w:spacing w:after="120"/>
+        <w:jc w:val="both"/>
+      </w:pPr>
+      <w:r>
+        <w:t>Le réseau d’agences d’une banque génère un volume important d’informations relatives aux agences, aux collaborateurs, aux clients et aux objectifs commerciaux. La gestion de ces informations à l’aide d’outils bureautiques dispersés (fichiers tableurs, documents isolés) atteint rapidement ses limites en matière de cohérence, de traçabilité et de restitution.</w:t>
+      </w:r>
+    </w:p>
+    <w:p>
+      <w:pPr>
+        <w:spacing w:after="120"/>
+        <w:jc w:val="both"/>
+      </w:pPr>
+      <w:r>
+        <w:t>L’objectif du stage est double : (i) concevoir une application web centralisée pour la gestion opérationnelle du réseau d’agences et (ii) mettre en place un volet décisionnel permettant de transformer les données opérationnelles en indicateurs exploitables par les responsables.</w:t>
+      </w:r>
+    </w:p>
+    <w:p>
+      <w:pPr>
+        <w:pStyle w:val="Titre2"/>
+      </w:pPr>
+      <w:r>
+        <w:t>1.4  Étude de l’existant</w:t>
+      </w:r>
+    </w:p>
+    <w:p>
+      <w:pPr>
+        <w:pStyle w:val="Titre3"/>
+      </w:pPr>
+      <w:r>
+        <w:t>1.4.1  Description de l’existant</w:t>
+      </w:r>
+    </w:p>
+    <w:p>
+      <w:pPr>
+        <w:spacing w:after="120"/>
+        <w:jc w:val="both"/>
+      </w:pPr>
+      <w:r>
+        <w:t>La gestion actuelle repose en grande partie sur des traitements manuels et des fichiers non centralisés. Les données relatives aux agences, aux employés et aux clients sont saisies et conservées de manière hétérogène, et les demandes de création ou de modification circulent par des canaux informels (courriel, documents papier).</w:t>
+      </w:r>
+    </w:p>
+    <w:p>
+      <w:pPr>
+        <w:pStyle w:val="Titre3"/>
+      </w:pPr>
+      <w:r>
+        <w:t>1.4.2  Critique de l’existant</w:t>
+      </w:r>
+    </w:p>
+    <w:p>
+      <w:pPr>
+        <w:spacing w:after="120"/>
+        <w:jc w:val="both"/>
+      </w:pPr>
+      <w:r>
+        <w:t>Cette organisation présente plusieurs limites :</w:t>
+      </w:r>
+    </w:p>
+    <w:p>
+      <w:pPr>
+        <w:pStyle w:val="Paragraphedeliste"/>
+        <w:jc w:val="both"/>
+      </w:pPr>
+      <w:r>
+        <w:t>•  Dispersion et redondance des données, source d’incohérences.</w:t>
+      </w:r>
+    </w:p>
+    <w:p>
+      <w:pPr>
+        <w:pStyle w:val="Paragraphedeliste"/>
+        <w:jc w:val="both"/>
+      </w:pPr>
+      <w:r>
+        <w:t>•  Absence de circuit de validation formalisé pour les opérations sensibles.</w:t>
+      </w:r>
+    </w:p>
+    <w:p>
+      <w:pPr>
+        <w:pStyle w:val="Paragraphedeliste"/>
+        <w:jc w:val="both"/>
+      </w:pPr>
+      <w:r>
+        <w:t>•  Faible traçabilité des actions et des décisions.</w:t>
+      </w:r>
+    </w:p>
+    <w:p>
+      <w:pPr>
+        <w:pStyle w:val="Paragraphedeliste"/>
+        <w:jc w:val="both"/>
+      </w:pPr>
+      <w:r>
+        <w:t>•  Difficulté à produire des indicateurs consolidés pour le pilotage.</w:t>
+      </w:r>
+    </w:p>
+    <w:p>
+      <w:pPr>
+        <w:pStyle w:val="Paragraphedeliste"/>
+        <w:jc w:val="both"/>
+      </w:pPr>
+      <w:r>
+        <w:t>•  Sécurité et gestion des droits d’accès insuffisamment maîtrisées.</w:t>
+      </w:r>
+    </w:p>
+    <w:p>
+      <w:pPr>
+        <w:pStyle w:val="Titre2"/>
+      </w:pPr>
+      <w:r>
+        <w:t>1.5  Problématique</w:t>
+      </w:r>
+    </w:p>
+    <w:p>
+      <w:pPr>
+        <w:spacing w:after="120"/>
+        <w:jc w:val="both"/>
+      </w:pPr>
+      <w:r>
+        <w:t>Comment centraliser et fiabiliser la gestion du réseau d’agences bancaires, tout en encadrant les opérations sensibles par des circuits de validation, et comment exploiter les données ainsi structurées pour fournir aux responsables des indicateurs d’aide à la décision ?</w:t>
+      </w:r>
+    </w:p>
+    <w:p>
+      <w:pPr>
+        <w:pStyle w:val="Titre2"/>
+      </w:pPr>
+      <w:r>
+        <w:t>1.6  Solution proposée</w:t>
+      </w:r>
+    </w:p>
+    <w:p>
+      <w:pPr>
+        <w:spacing w:after="120"/>
+        <w:jc w:val="both"/>
+      </w:pPr>
+      <w:r>
+        <w:t>La solution consiste en une application web centralisée, structurée autour d’une base de données relationnelle Oracle, qui couvre la gestion des agences, des employés, des clients et des objectifs, et qui formalise les demandes de création et de modification via des workflows de validation. Un volet décisionnel complète le dispositif : des vues analytiques alimentent Microsoft Power BI, et un tableau de bord embarqué restitue les indicateurs clés directement dans l’application.</w:t>
+      </w:r>
+    </w:p>
+    <w:p>
+      <w:pPr>
+        <w:pStyle w:val="Titre2"/>
+      </w:pPr>
+      <w:r>
+        <w:t>1.7  Méthodologie de travail</w:t>
+      </w:r>
+    </w:p>
+    <w:p>
+      <w:pPr>
+        <w:spacing w:after="120"/>
+        <w:jc w:val="both"/>
+      </w:pPr>
+      <w:r>
+        <w:t>Le projet a été conduit selon une démarche itérative et incrémentale, inspirée des principes agiles. Chaque module (gestion des agences, des employés, des clients, des objectifs, puis le volet décisionnel) a été spécifié, conçu, développé puis testé avant l’intégration du suivant. Le langage de modélisation UML a servi de support à l’analyse et à la conception.</w:t>
+      </w:r>
+    </w:p>
+    <w:p>
+      <w:pPr>
+        <w:pStyle w:val="Titre2"/>
+      </w:pPr>
+      <w:r>
+        <w:t>1.8  Conclusion</w:t>
+      </w:r>
+    </w:p>
+    <w:p>
+      <w:pPr>
+        <w:spacing w:after="120"/>
+        <w:jc w:val="both"/>
+      </w:pPr>
+      <w:r>
+        <w:t>Après avoir situé le projet et dégagé sa problématique, le chapitre suivant formalise les besoins fonctionnels et non fonctionnels de la solution.</w:t>
+      </w:r>
+    </w:p>
+    <w:p>
+      <w:r>
+        <w:br w:type="page"/>
+      </w:r>
+    </w:p>
+    <w:p>
+      <w:pPr>
+        <w:pStyle w:val="Titre1"/>
+      </w:pPr>
+      <w:r>
+        <w:t>Chapitre 2 : Analyse et spécification des besoins</w:t>
+      </w:r>
+    </w:p>
+    <w:p>
+      <w:pPr>
+        <w:pStyle w:val="Titre2"/>
+      </w:pPr>
+      <w:r>
+        <w:t>2.1  Introduction</w:t>
+      </w:r>
+    </w:p>
+    <w:p>
+      <w:pPr>
+        <w:spacing w:after="120"/>
+        <w:jc w:val="both"/>
+      </w:pPr>
+      <w:r>
+        <w:t>Ce chapitre identifie les acteurs du système et spécifie les besoins fonctionnels et non fonctionnels, illustrés par les principaux cas d’utilisation.</w:t>
+      </w:r>
+    </w:p>
+    <w:p>
+      <w:pPr>
+        <w:pStyle w:val="Titre2"/>
+      </w:pPr>
+      <w:r>
+        <w:t>2.2  Identification des acteurs</w:t>
+      </w:r>
+    </w:p>
+    <w:p>
+      <w:pPr>
+        <w:spacing w:after="120"/>
+        <w:jc w:val="both"/>
+      </w:pPr>
+      <w:r>
+        <w:t>Trois profils principaux interagissent avec l’application, conformément aux rôles gérés par le module de sécurité :</w:t>
+      </w:r>
+    </w:p>
+    <w:tbl>
+      <w:tblPr>
+        <w:tblW w:type="auto" w:w="0"/>
+        <w:jc w:val="center"/>
+        <w:tblLook w:firstColumn="1" w:firstRow="1" w:lastColumn="0" w:lastRow="0" w:noHBand="0" w:noVBand="1" w:val="04A0"/>
+        <w:tblBorders>
+          <w:top w:val="single" w:sz="4" w:space="0" w:color="999999"/>
+          <w:left w:val="single" w:sz="4" w:space="0" w:color="999999"/>
+          <w:bottom w:val="single" w:sz="4" w:space="0" w:color="999999"/>
+          <w:right w:val="single" w:sz="4" w:space="0" w:color="999999"/>
+          <w:insideH w:val="single" w:sz="4" w:space="0" w:color="999999"/>
+          <w:insideV w:val="single" w:sz="4" w:space="0" w:color="999999"/>
+        </w:tblBorders>
+      </w:tblPr>
+      <w:tblGrid>
+        <w:gridCol w:w="4536"/>
+        <w:gridCol w:w="4536"/>
+      </w:tblGrid>
+      <w:tr>
+        <w:tc>
+          <w:tcPr>
+            <w:tcW w:type="dxa" w:w="4536"/>
+          </w:tcPr>
+          <w:p>
+            <w:r/>
+            <w:r>
+              <w:rPr>
+                <w:b/>
+              </w:rPr>
+              <w:t>Acteur</w:t>
             </w:r>
           </w:p>
         </w:tc>
@@ -2967,6 +3373,230 @@
           </w:tcPr>
           <w:p>
             <w:r>
+              <w:t>Administrateur (ADMIN)</w:t>
+            </w:r>
+          </w:p>
+        </w:tc>
+        <w:tc>
+          <w:tcPr>
+            <w:tcW w:type="dxa" w:w="4536"/>
+          </w:tcPr>
+          <w:p>
+            <w:r>
+              <w:t>Gère les agences, les employés et les clients ; valide les demandes de création de clients et d’employés ; supervise l’activité.</w:t>
+            </w:r>
+          </w:p>
+        </w:tc>
+      </w:tr>
+      <w:tr>
+        <w:tc>
+          <w:tcPr>
+            <w:tcW w:type="dxa" w:w="4536"/>
+          </w:tcPr>
+          <w:p>
+            <w:r>
+              <w:t>Directeur commercial (DIRECTEUR_COMMERCIAL)</w:t>
+            </w:r>
+          </w:p>
+        </w:tc>
+        <w:tc>
+          <w:tcPr>
+            <w:tcW w:type="dxa" w:w="4536"/>
+          </w:tcPr>
+          <w:p>
+            <w:r>
+              <w:t>Soumet les demandes de création (clients, employés) ; valide les demandes de modification des données des employés.</w:t>
+            </w:r>
+          </w:p>
+        </w:tc>
+      </w:tr>
+      <w:tr>
+        <w:tc>
+          <w:tcPr>
+            <w:tcW w:type="dxa" w:w="4536"/>
+          </w:tcPr>
+          <w:p>
+            <w:r>
+              <w:t>Utilisateur (USER)</w:t>
+            </w:r>
+          </w:p>
+        </w:tc>
+        <w:tc>
+          <w:tcPr>
+            <w:tcW w:type="dxa" w:w="4536"/>
+          </w:tcPr>
+          <w:p>
+            <w:r>
+              <w:t>Consulte les données autorisées et soumet des demandes de modification concernant ses propres informations.</w:t>
+            </w:r>
+          </w:p>
+        </w:tc>
+      </w:tr>
+    </w:tbl>
+    <w:p>
+      <w:pPr/>
+    </w:p>
+    <w:p>
+      <w:pPr>
+        <w:pStyle w:val="Titre2"/>
+      </w:pPr>
+      <w:r>
+        <w:t>2.3  Besoins fonctionnels</w:t>
+      </w:r>
+    </w:p>
+    <w:p>
+      <w:pPr>
+        <w:spacing w:after="120"/>
+        <w:jc w:val="both"/>
+      </w:pPr>
+      <w:r>
+        <w:t>Le système doit permettre :</w:t>
+      </w:r>
+    </w:p>
+    <w:p>
+      <w:pPr>
+        <w:pStyle w:val="Paragraphedeliste"/>
+        <w:jc w:val="both"/>
+      </w:pPr>
+      <w:r>
+        <w:t>•  L’authentification sécurisée et la gestion des rôles et des droits d’accès.</w:t>
+      </w:r>
+    </w:p>
+    <w:p>
+      <w:pPr>
+        <w:pStyle w:val="Paragraphedeliste"/>
+        <w:jc w:val="both"/>
+      </w:pPr>
+      <w:r>
+        <w:t>•  La gestion des agences (création, consultation, mise à jour, suppression).</w:t>
+      </w:r>
+    </w:p>
+    <w:p>
+      <w:pPr>
+        <w:pStyle w:val="Paragraphedeliste"/>
+        <w:jc w:val="both"/>
+      </w:pPr>
+      <w:r>
+        <w:t>•  La gestion des employés (effectifs), incluant leur rattachement aux agences.</w:t>
+      </w:r>
+    </w:p>
+    <w:p>
+      <w:pPr>
+        <w:pStyle w:val="Paragraphedeliste"/>
+        <w:jc w:val="both"/>
+      </w:pPr>
+      <w:r>
+        <w:t>•  La gestion des clients (portefeuille), avec typologie et secteur d’activité.</w:t>
+      </w:r>
+    </w:p>
+    <w:p>
+      <w:pPr>
+        <w:pStyle w:val="Paragraphedeliste"/>
+        <w:jc w:val="both"/>
+      </w:pPr>
+      <w:r>
+        <w:t>•  La gestion des objectifs commerciaux et le suivi de la production.</w:t>
+      </w:r>
+    </w:p>
+    <w:p>
+      <w:pPr>
+        <w:pStyle w:val="Paragraphedeliste"/>
+        <w:jc w:val="both"/>
+      </w:pPr>
+      <w:r>
+        <w:t>•  La soumission et la validation des demandes (clients, employés, modifications) selon un cycle EN_ATTENTE → EN_COURS → EFFECTUÉ / REFUSÉ.</w:t>
+      </w:r>
+    </w:p>
+    <w:p>
+      <w:pPr>
+        <w:pStyle w:val="Paragraphedeliste"/>
+        <w:jc w:val="both"/>
+      </w:pPr>
+      <w:r>
+        <w:t>•  La notification des demandes en attente selon le rôle de l’utilisateur.</w:t>
+      </w:r>
+    </w:p>
+    <w:p>
+      <w:pPr>
+        <w:pStyle w:val="Paragraphedeliste"/>
+        <w:jc w:val="both"/>
+      </w:pPr>
+      <w:r>
+        <w:t>•  La journalisation des actions (audit) et l’affichage de l’activité récente.</w:t>
+      </w:r>
+    </w:p>
+    <w:p>
+      <w:pPr>
+        <w:pStyle w:val="Paragraphedeliste"/>
+        <w:jc w:val="both"/>
+      </w:pPr>
+      <w:r>
+        <w:t>•  La restitution d’indicateurs via un tableau de bord et via Power BI.</w:t>
+      </w:r>
+    </w:p>
+    <w:p>
+      <w:pPr>
+        <w:pStyle w:val="Titre2"/>
+      </w:pPr>
+      <w:r>
+        <w:t>2.4  Besoins non fonctionnels</w:t>
+      </w:r>
+    </w:p>
+    <w:tbl>
+      <w:tblPr>
+        <w:tblW w:type="auto" w:w="0"/>
+        <w:jc w:val="center"/>
+        <w:tblLook w:firstColumn="1" w:firstRow="1" w:lastColumn="0" w:lastRow="0" w:noHBand="0" w:noVBand="1" w:val="04A0"/>
+        <w:tblBorders>
+          <w:top w:val="single" w:sz="4" w:space="0" w:color="999999"/>
+          <w:left w:val="single" w:sz="4" w:space="0" w:color="999999"/>
+          <w:bottom w:val="single" w:sz="4" w:space="0" w:color="999999"/>
+          <w:right w:val="single" w:sz="4" w:space="0" w:color="999999"/>
+          <w:insideH w:val="single" w:sz="4" w:space="0" w:color="999999"/>
+          <w:insideV w:val="single" w:sz="4" w:space="0" w:color="999999"/>
+        </w:tblBorders>
+      </w:tblPr>
+      <w:tblGrid>
+        <w:gridCol w:w="4536"/>
+        <w:gridCol w:w="4536"/>
+      </w:tblGrid>
+      <w:tr>
+        <w:tc>
+          <w:tcPr>
+            <w:tcW w:type="dxa" w:w="4536"/>
+          </w:tcPr>
+          <w:p>
+            <w:r/>
+            <w:r>
+              <w:rPr>
+                <w:b/>
+              </w:rPr>
+              <w:t>Besoin</w:t>
+            </w:r>
+          </w:p>
+        </w:tc>
+        <w:tc>
+          <w:tcPr>
+            <w:tcW w:type="dxa" w:w="4536"/>
+          </w:tcPr>
+          <w:p>
+            <w:r/>
+            <w:r>
+              <w:rPr>
+                <w:b/>
+              </w:rPr>
+              <w:t>Description</w:t>
+            </w:r>
+          </w:p>
+        </w:tc>
+      </w:tr>
+      <w:tr>
+        <w:tc>
+          <w:tcPr>
+            <w:tcW w:type="dxa" w:w="4536"/>
+          </w:tcPr>
+          <w:p>
+            <w:r>
               <w:t>Sécurité</w:t>
             </w:r>
           </w:p>
@@ -3121,7 +3751,7 @@
         <w:drawing>
           <wp:inline xmlns:a="http://schemas.openxmlformats.org/drawingml/2006/main" xmlns:pic="http://schemas.openxmlformats.org/drawingml/2006/picture">
             <wp:extent cx="5760720" cy="6046308"/>
-            <wp:docPr id="11" name="Picture 11"/>
+            <wp:docPr id="12" name="Picture 12"/>
             <wp:cNvGraphicFramePr>
               <a:graphicFrameLocks noChangeAspect="1"/>
             </wp:cNvGraphicFramePr>
@@ -3133,7 +3763,7 @@
                     <pic:cNvPicPr/>
                   </pic:nvPicPr>
                   <pic:blipFill>
-                    <a:blip r:embed="rId12"/>
+                    <a:blip r:embed="rId13"/>
                     <a:stretch>
                       <a:fillRect/>
                     </a:stretch>
@@ -3341,7 +3971,7 @@
         <w:drawing>
           <wp:inline xmlns:a="http://schemas.openxmlformats.org/drawingml/2006/main" xmlns:pic="http://schemas.openxmlformats.org/drawingml/2006/picture">
             <wp:extent cx="5760720" cy="6739975"/>
-            <wp:docPr id="12" name="Picture 12"/>
+            <wp:docPr id="13" name="Picture 13"/>
             <wp:cNvGraphicFramePr>
               <a:graphicFrameLocks noChangeAspect="1"/>
             </wp:cNvGraphicFramePr>
@@ -3353,7 +3983,7 @@
                     <pic:cNvPicPr/>
                   </pic:nvPicPr>
                   <pic:blipFill>
-                    <a:blip r:embed="rId13"/>
+                    <a:blip r:embed="rId14"/>
                     <a:stretch>
                       <a:fillRect/>
                     </a:stretch>
@@ -3418,7 +4048,7 @@
         <w:drawing>
           <wp:inline xmlns:a="http://schemas.openxmlformats.org/drawingml/2006/main" xmlns:pic="http://schemas.openxmlformats.org/drawingml/2006/picture">
             <wp:extent cx="5760720" cy="4041997"/>
-            <wp:docPr id="13" name="Picture 13"/>
+            <wp:docPr id="14" name="Picture 14"/>
             <wp:cNvGraphicFramePr>
               <a:graphicFrameLocks noChangeAspect="1"/>
             </wp:cNvGraphicFramePr>
@@ -3430,7 +4060,7 @@
                     <pic:cNvPicPr/>
                   </pic:nvPicPr>
                   <pic:blipFill>
-                    <a:blip r:embed="rId14"/>
+                    <a:blip r:embed="rId15"/>
                     <a:stretch>
                       <a:fillRect/>
                     </a:stretch>
@@ -3487,7 +4117,7 @@
         <w:drawing>
           <wp:inline xmlns:a="http://schemas.openxmlformats.org/drawingml/2006/main" xmlns:pic="http://schemas.openxmlformats.org/drawingml/2006/picture">
             <wp:extent cx="5760720" cy="3275176"/>
-            <wp:docPr id="14" name="Picture 14"/>
+            <wp:docPr id="15" name="Picture 15"/>
             <wp:cNvGraphicFramePr>
               <a:graphicFrameLocks noChangeAspect="1"/>
             </wp:cNvGraphicFramePr>
@@ -3499,7 +4129,7 @@
                     <pic:cNvPicPr/>
                   </pic:nvPicPr>
                   <pic:blipFill>
-                    <a:blip r:embed="rId15"/>
+                    <a:blip r:embed="rId16"/>
                     <a:stretch>
                       <a:fillRect/>
                     </a:stretch>
@@ -3762,7 +4392,7 @@
         <w:drawing>
           <wp:inline xmlns:a="http://schemas.openxmlformats.org/drawingml/2006/main" xmlns:pic="http://schemas.openxmlformats.org/drawingml/2006/picture">
             <wp:extent cx="5760720" cy="3404586"/>
-            <wp:docPr id="15" name="Picture 15"/>
+            <wp:docPr id="16" name="Picture 16"/>
             <wp:cNvGraphicFramePr>
               <a:graphicFrameLocks noChangeAspect="1"/>
             </wp:cNvGraphicFramePr>
@@ -3774,7 +4404,7 @@
                     <pic:cNvPicPr/>
                   </pic:nvPicPr>
                   <pic:blipFill>
-                    <a:blip r:embed="rId16"/>
+                    <a:blip r:embed="rId17"/>
                     <a:stretch>
                       <a:fillRect/>
                     </a:stretch>
@@ -3974,7 +4604,7 @@
         <w:drawing>
           <wp:inline xmlns:a="http://schemas.openxmlformats.org/drawingml/2006/main" xmlns:pic="http://schemas.openxmlformats.org/drawingml/2006/picture">
             <wp:extent cx="5760720" cy="2603917"/>
-            <wp:docPr id="16" name="Picture 16"/>
+            <wp:docPr id="17" name="Picture 17"/>
             <wp:cNvGraphicFramePr>
               <a:graphicFrameLocks noChangeAspect="1"/>
             </wp:cNvGraphicFramePr>
@@ -3986,7 +4616,7 @@
                     <pic:cNvPicPr/>
                   </pic:nvPicPr>
                   <pic:blipFill>
-                    <a:blip r:embed="rId17"/>
+                    <a:blip r:embed="rId18"/>
                     <a:stretch>
                       <a:fillRect/>
                     </a:stretch>
@@ -4871,7 +5501,7 @@
         <w:drawing>
           <wp:inline xmlns:a="http://schemas.openxmlformats.org/drawingml/2006/main" xmlns:pic="http://schemas.openxmlformats.org/drawingml/2006/picture">
             <wp:extent cx="5760720" cy="1347623"/>
-            <wp:docPr id="17" name="Picture 17"/>
+            <wp:docPr id="18" name="Picture 18"/>
             <wp:cNvGraphicFramePr>
               <a:graphicFrameLocks noChangeAspect="1"/>
             </wp:cNvGraphicFramePr>
@@ -4883,7 +5513,7 @@
                     <pic:cNvPicPr/>
                   </pic:nvPicPr>
                   <pic:blipFill>
-                    <a:blip r:embed="rId18"/>
+                    <a:blip r:embed="rId19"/>
                     <a:stretch>
                       <a:fillRect/>
                     </a:stretch>

</xml_diff>

<commit_message>
Put BTK logo on the cover and add a "Plan du rapport" page
- Replace the cover's generic "LOGOTEXT" placeholder (word/media/image2.png)
  with the BTK logo, fitted to the placeholder box to avoid distortion; the
  Esprit School of Business cover logo is kept.
- Add a "Plan du rapport" page after the introduction that defines each of the
  four chapters.

Co-Authored-By: Claude Opus 4.8 <noreply@anthropic.com>
Claude-Session: https://claude.ai/code/session_01XrCEv79rD628gYBfC2XWx6
</commit_message>
<xml_diff>
--- a/rapport/Rapport_de_stage_PFE_gestion-agences.docx
+++ b/rapport/Rapport_de_stage_PFE_gestion-agences.docx
@@ -2399,6 +2399,88 @@
       </w:pPr>
       <w:r>
         <w:t>Ce rapport est organisé en quatre chapitres. Le premier présente le cadre général du projet : l’organisme d’accueil, l’étude de l’existant, la problématique et la solution proposée. Le deuxième est consacré à l’analyse et à la spécification des besoins. Le troisième détaille la conception de l’application et du volet décisionnel. Le quatrième décrit la réalisation et les technologies mises en œuvre. Une conclusion générale dresse le bilan du travail et ouvre des perspectives d’évolution.</w:t>
+      </w:r>
+    </w:p>
+    <w:p>
+      <w:r>
+        <w:br w:type="page"/>
+      </w:r>
+    </w:p>
+    <w:p>
+      <w:pPr>
+        <w:pStyle w:val="Titre1"/>
+      </w:pPr>
+      <w:r>
+        <w:t>Plan du rapport</w:t>
+      </w:r>
+    </w:p>
+    <w:p>
+      <w:pPr>
+        <w:spacing w:after="120"/>
+        <w:jc w:val="both"/>
+      </w:pPr>
+      <w:r>
+        <w:t>Le présent rapport s’articule autour de quatre chapitres, encadrés par une introduction et une conclusion générales :</w:t>
+      </w:r>
+    </w:p>
+    <w:p>
+      <w:pPr>
+        <w:spacing w:after="160"/>
+        <w:jc w:val="both"/>
+      </w:pPr>
+      <w:r>
+        <w:rPr>
+          <w:b/>
+        </w:rPr>
+        <w:t xml:space="preserve">Chapitre 1 : Cadre général du projet — </w:t>
+      </w:r>
+      <w:r>
+        <w:t>présente l’organisme d’accueil (la BTK – Banque Tuniso-Koweïtienne), l’étude de l’existant, la problématique et la solution proposée, ainsi que la méthodologie de travail adoptée.</w:t>
+      </w:r>
+    </w:p>
+    <w:p>
+      <w:pPr>
+        <w:spacing w:after="160"/>
+        <w:jc w:val="both"/>
+      </w:pPr>
+      <w:r>
+        <w:rPr>
+          <w:b/>
+        </w:rPr>
+        <w:t xml:space="preserve">Chapitre 2 : Analyse et spécification des besoins — </w:t>
+      </w:r>
+      <w:r>
+        <w:t>identifie les acteurs du système et spécifie les besoins fonctionnels et non fonctionnels, illustrés par les principaux cas d’utilisation.</w:t>
+      </w:r>
+    </w:p>
+    <w:p>
+      <w:pPr>
+        <w:spacing w:after="160"/>
+        <w:jc w:val="both"/>
+      </w:pPr>
+      <w:r>
+        <w:rPr>
+          <w:b/>
+        </w:rPr>
+        <w:t xml:space="preserve">Chapitre 3 : Conception — </w:t>
+      </w:r>
+      <w:r>
+        <w:t>décrit l’architecture en couches de l’application, le diagramme de classes, la base de données et la conception du volet décisionnel (Business Intelligence).</w:t>
+      </w:r>
+    </w:p>
+    <w:p>
+      <w:pPr>
+        <w:spacing w:after="160"/>
+        <w:jc w:val="both"/>
+      </w:pPr>
+      <w:r>
+        <w:rPr>
+          <w:b/>
+        </w:rPr>
+        <w:t xml:space="preserve">Chapitre 4 : Réalisation — </w:t>
+      </w:r>
+      <w:r>
+        <w:t>présente l’environnement et les choix technologiques, les interfaces de l’application et la mise en œuvre du tableau de bord et des rapports Power BI.</w:t>
       </w:r>
     </w:p>
     <w:p>

</xml_diff>